<commit_message>
OS LR 2 solution fix
</commit_message>
<xml_diff>
--- a/BSUIR/semestre 5/OS/Сушко_381574_ОС_ЛР 2.docx
+++ b/BSUIR/semestre 5/OS/Сушко_381574_ОС_ЛР 2.docx
@@ -167,7 +167,6 @@
         <w:rPr>
           <w:rFonts w:cs="Times New Roman"/>
           <w:szCs w:val="28"/>
-          <w:lang w:val="en-US"/>
         </w:rPr>
       </w:pPr>
       <w:r>
@@ -195,7 +194,6 @@
         <w:rPr>
           <w:rFonts w:cs="Times New Roman"/>
           <w:szCs w:val="28"/>
-          <w:lang w:val="en-US"/>
         </w:rPr>
         <w:t>2</w:t>
       </w:r>
@@ -542,7 +540,23 @@
                 <w:rFonts w:cs="Times New Roman"/>
                 <w:szCs w:val="28"/>
               </w:rPr>
-              <w:t xml:space="preserve">кафедры ИСиТ, </w:t>
+              <w:t xml:space="preserve">кафедры </w:t>
+            </w:r>
+            <w:proofErr w:type="spellStart"/>
+            <w:r>
+              <w:rPr>
+                <w:rFonts w:cs="Times New Roman"/>
+                <w:szCs w:val="28"/>
+              </w:rPr>
+              <w:t>ИСиТ</w:t>
+            </w:r>
+            <w:proofErr w:type="spellEnd"/>
+            <w:r>
+              <w:rPr>
+                <w:rFonts w:cs="Times New Roman"/>
+                <w:szCs w:val="28"/>
+              </w:rPr>
+              <w:t xml:space="preserve">, </w:t>
             </w:r>
           </w:p>
           <w:p>
@@ -879,7 +893,23 @@
         <w:jc w:val="both"/>
       </w:pPr>
       <w:r>
-        <w:t>Вариант 5. Создать командный файл P5.bat. В качестве первого параметра при запуске этого пакетного файла предполагается ввод одного из слов: Редактор(1), Память(2), Директория(3). В случае 1 необходимо запустить программу Edit. В случае 2 следует запустить программу Mem с ключом, заданным во втором параметре, а в случае 3 – обеспечить запись содержимого директории, заданной вторым параметром, в файл dir_3.txt, местонахождение которого определяется третьим параметром.</w:t>
+        <w:t xml:space="preserve">Вариант 5. Создать командный файл P5.bat. В качестве первого параметра при запуске этого пакетного файла предполагается ввод одного из слов: Редактор(1), Память(2), Директория(3). В случае 1 необходимо запустить программу </w:t>
+      </w:r>
+      <w:proofErr w:type="spellStart"/>
+      <w:r>
+        <w:t>Edit</w:t>
+      </w:r>
+      <w:proofErr w:type="spellEnd"/>
+      <w:r>
+        <w:t xml:space="preserve">. В случае 2 следует запустить программу </w:t>
+      </w:r>
+      <w:proofErr w:type="spellStart"/>
+      <w:r>
+        <w:t>Mem</w:t>
+      </w:r>
+      <w:proofErr w:type="spellEnd"/>
+      <w:r>
+        <w:t xml:space="preserve"> с ключом, заданным во втором параметре, а в случае 3 – обеспечить запись содержимого директории, заданной вторым параметром, в файл dir_3.txt, местонахождение которого определяется третьим параметром.</w:t>
       </w:r>
     </w:p>
     <w:p>
@@ -892,17 +922,11 @@
       <w:pPr>
         <w:ind w:firstLine="851"/>
         <w:jc w:val="both"/>
-        <w:rPr>
-          <w:lang w:val="en-US"/>
-        </w:rPr>
       </w:pPr>
       <w:r>
         <w:t>Листинг кода программы</w:t>
       </w:r>
       <w:r>
-        <w:rPr>
-          <w:lang w:val="en-US"/>
-        </w:rPr>
         <w:t>:</w:t>
       </w:r>
     </w:p>
@@ -916,20 +940,11 @@
       <w:pPr>
         <w:ind w:firstLine="851"/>
         <w:jc w:val="both"/>
-        <w:rPr>
-          <w:lang w:val="en-US"/>
-        </w:rPr>
-      </w:pPr>
-      <w:r>
-        <w:t xml:space="preserve">Результат работы </w:t>
-      </w:r>
-      <w:r>
-        <w:t>программы</w:t>
-      </w:r>
-      <w:r>
-        <w:rPr>
-          <w:lang w:val="en-US"/>
-        </w:rPr>
+      </w:pPr>
+      <w:r>
+        <w:t>Результат работы программы</w:t>
+      </w:r>
+      <w:r>
         <w:t>:</w:t>
       </w:r>
     </w:p>
@@ -937,9 +952,6 @@
       <w:pPr>
         <w:ind w:firstLine="851"/>
         <w:jc w:val="both"/>
-        <w:rPr>
-          <w:lang w:val="en-US"/>
-        </w:rPr>
       </w:pPr>
     </w:p>
     <w:p>
@@ -952,7 +964,7 @@
           <w:bCs/>
           <w:color w:val="000000"/>
           <w:szCs w:val="28"/>
-          <w:lang w:eastAsia="ru-RU"/>
+          <w:lang w:val="en-US" w:eastAsia="ru-RU"/>
         </w:rPr>
       </w:pPr>
     </w:p>
@@ -965,7 +977,7 @@
           <w:bCs/>
           <w:color w:val="000000"/>
           <w:szCs w:val="28"/>
-          <w:lang w:eastAsia="ru-RU"/>
+          <w:lang w:val="en-US" w:eastAsia="ru-RU"/>
         </w:rPr>
       </w:pPr>
       <w:r>
@@ -975,7 +987,7 @@
           <w:bCs/>
           <w:color w:val="000000"/>
           <w:szCs w:val="28"/>
-          <w:lang w:eastAsia="ru-RU"/>
+          <w:lang w:val="en-US" w:eastAsia="ru-RU"/>
         </w:rPr>
         <w:br w:type="page"/>
       </w:r>
@@ -1073,13 +1085,7 @@
         <w:t xml:space="preserve"> </w:t>
       </w:r>
       <w:r>
-        <w:t>возможность автоматизации управления операционной системой с помощью командных файлов. Научи</w:t>
-      </w:r>
-      <w:r>
-        <w:t>лся</w:t>
-      </w:r>
-      <w:r>
-        <w:t xml:space="preserve"> создавать командные файлы и применять специфичные для них команды консольного режима на практике.</w:t>
+        <w:t>возможность автоматизации управления операционной системой с помощью командных файлов. Научился создавать командные файлы и применять специфичные для них команды консольного режима на практике.</w:t>
       </w:r>
     </w:p>
     <w:sectPr>

</xml_diff>

<commit_message>
OS LR 1 solution, report, IAD PR solution fixes
</commit_message>
<xml_diff>
--- a/BSUIR/semestre 5/OS/Сушко_381574_ОС_ЛР 2.docx
+++ b/BSUIR/semestre 5/OS/Сушко_381574_ОС_ЛР 2.docx
@@ -540,23 +540,7 @@
                 <w:rFonts w:cs="Times New Roman"/>
                 <w:szCs w:val="28"/>
               </w:rPr>
-              <w:t xml:space="preserve">кафедры </w:t>
-            </w:r>
-            <w:proofErr w:type="spellStart"/>
-            <w:r>
-              <w:rPr>
-                <w:rFonts w:cs="Times New Roman"/>
-                <w:szCs w:val="28"/>
-              </w:rPr>
-              <w:t>ИСиТ</w:t>
-            </w:r>
-            <w:proofErr w:type="spellEnd"/>
-            <w:r>
-              <w:rPr>
-                <w:rFonts w:cs="Times New Roman"/>
-                <w:szCs w:val="28"/>
-              </w:rPr>
-              <w:t xml:space="preserve">, </w:t>
+              <w:t xml:space="preserve">кафедры ИСиТ, </w:t>
             </w:r>
           </w:p>
           <w:p>
@@ -893,23 +877,7 @@
         <w:jc w:val="both"/>
       </w:pPr>
       <w:r>
-        <w:t xml:space="preserve">Вариант 5. Создать командный файл P5.bat. В качестве первого параметра при запуске этого пакетного файла предполагается ввод одного из слов: Редактор(1), Память(2), Директория(3). В случае 1 необходимо запустить программу </w:t>
-      </w:r>
-      <w:proofErr w:type="spellStart"/>
-      <w:r>
-        <w:t>Edit</w:t>
-      </w:r>
-      <w:proofErr w:type="spellEnd"/>
-      <w:r>
-        <w:t xml:space="preserve">. В случае 2 следует запустить программу </w:t>
-      </w:r>
-      <w:proofErr w:type="spellStart"/>
-      <w:r>
-        <w:t>Mem</w:t>
-      </w:r>
-      <w:proofErr w:type="spellEnd"/>
-      <w:r>
-        <w:t xml:space="preserve"> с ключом, заданным во втором параметре, а в случае 3 – обеспечить запись содержимого директории, заданной вторым параметром, в файл dir_3.txt, местонахождение которого определяется третьим параметром.</w:t>
+        <w:t>Вариант 5. Создать командный файл P5.bat. В качестве первого параметра при запуске этого пакетного файла предполагается ввод одного из слов: Редактор(1), Память(2), Директория(3). В случае 1 необходимо запустить программу Edit. В случае 2 следует запустить программу Mem с ключом, заданным во втором параметре, а в случае 3 – обеспечить запись содержимого директории, заданной вторым параметром, в файл dir_3.txt, местонахождение которого определяется третьим параметром.</w:t>
       </w:r>
     </w:p>
     <w:p>
@@ -932,15 +900,481 @@
     </w:p>
     <w:p>
       <w:pPr>
+        <w:jc w:val="both"/>
+      </w:pPr>
+      <w:r>
+        <w:t>@echo off</w:t>
+      </w:r>
+    </w:p>
+    <w:p>
+      <w:pPr>
+        <w:jc w:val="both"/>
+      </w:pPr>
+      <w:r>
+        <w:t>chcp 1251</w:t>
+      </w:r>
+    </w:p>
+    <w:p>
+      <w:pPr>
+        <w:jc w:val="both"/>
+      </w:pPr>
+    </w:p>
+    <w:p>
+      <w:pPr>
+        <w:jc w:val="both"/>
+      </w:pPr>
+      <w:r>
+        <w:t>if "%1"=="" (</w:t>
+      </w:r>
+    </w:p>
+    <w:p>
+      <w:pPr>
+        <w:jc w:val="both"/>
+      </w:pPr>
+      <w:r>
+        <w:t xml:space="preserve">    echo Ошибка: Не указан первый параметр</w:t>
+      </w:r>
+    </w:p>
+    <w:p>
+      <w:pPr>
+        <w:jc w:val="both"/>
+      </w:pPr>
+      <w:r>
+        <w:t xml:space="preserve">    echo Использование: P5.bat [1^|2^|3] [параметр2] [параметр3]</w:t>
+      </w:r>
+    </w:p>
+    <w:p>
+      <w:pPr>
+        <w:jc w:val="both"/>
+      </w:pPr>
+      <w:r>
+        <w:t xml:space="preserve">    echo   1 - Редактор</w:t>
+      </w:r>
+    </w:p>
+    <w:p>
+      <w:pPr>
+        <w:jc w:val="both"/>
+      </w:pPr>
+      <w:r>
+        <w:t xml:space="preserve">    echo   2 - Память</w:t>
+      </w:r>
+    </w:p>
+    <w:p>
+      <w:pPr>
+        <w:jc w:val="both"/>
+      </w:pPr>
+      <w:r>
+        <w:t xml:space="preserve">    echo   3 - Директория</w:t>
+      </w:r>
+    </w:p>
+    <w:p>
+      <w:pPr>
+        <w:jc w:val="both"/>
+        <w:rPr>
+          <w:lang w:val="en-US"/>
+        </w:rPr>
+      </w:pPr>
+      <w:r>
+        <w:t xml:space="preserve">    </w:t>
+      </w:r>
+      <w:r>
+        <w:rPr>
+          <w:lang w:val="en-US"/>
+        </w:rPr>
+        <w:t>exit /b 1</w:t>
+      </w:r>
+    </w:p>
+    <w:p>
+      <w:pPr>
+        <w:jc w:val="both"/>
+        <w:rPr>
+          <w:lang w:val="en-US"/>
+        </w:rPr>
+      </w:pPr>
+      <w:r>
+        <w:rPr>
+          <w:lang w:val="en-US"/>
+        </w:rPr>
+        <w:t>)</w:t>
+      </w:r>
+    </w:p>
+    <w:p>
+      <w:pPr>
+        <w:jc w:val="both"/>
+        <w:rPr>
+          <w:lang w:val="en-US"/>
+        </w:rPr>
+      </w:pPr>
+    </w:p>
+    <w:p>
+      <w:pPr>
+        <w:jc w:val="both"/>
+        <w:rPr>
+          <w:lang w:val="en-US"/>
+        </w:rPr>
+      </w:pPr>
+      <w:r>
+        <w:rPr>
+          <w:lang w:val="en-US"/>
+        </w:rPr>
+        <w:t>if "%1"=="1" goto Editor</w:t>
+      </w:r>
+    </w:p>
+    <w:p>
+      <w:pPr>
+        <w:jc w:val="both"/>
+        <w:rPr>
+          <w:lang w:val="en-US"/>
+        </w:rPr>
+      </w:pPr>
+      <w:r>
+        <w:rPr>
+          <w:lang w:val="en-US"/>
+        </w:rPr>
+        <w:t xml:space="preserve">if "%1"=="2" goto Memory  </w:t>
+      </w:r>
+    </w:p>
+    <w:p>
+      <w:pPr>
+        <w:jc w:val="both"/>
+      </w:pPr>
+      <w:r>
+        <w:t>if "%1"=="3" goto Directory</w:t>
+      </w:r>
+    </w:p>
+    <w:p>
+      <w:pPr>
+        <w:jc w:val="both"/>
+      </w:pPr>
+    </w:p>
+    <w:p>
+      <w:pPr>
+        <w:jc w:val="both"/>
+      </w:pPr>
+      <w:r>
+        <w:t>echo Ошибка: Неверный первый параметр</w:t>
+      </w:r>
+    </w:p>
+    <w:p>
+      <w:pPr>
+        <w:jc w:val="both"/>
+        <w:rPr>
+          <w:lang w:val="en-US"/>
+        </w:rPr>
+      </w:pPr>
+      <w:r>
+        <w:rPr>
+          <w:lang w:val="en-US"/>
+        </w:rPr>
+        <w:t>exit /b 1</w:t>
+      </w:r>
+    </w:p>
+    <w:p>
+      <w:pPr>
+        <w:jc w:val="both"/>
+        <w:rPr>
+          <w:lang w:val="en-US"/>
+        </w:rPr>
+      </w:pPr>
+    </w:p>
+    <w:p>
+      <w:pPr>
+        <w:jc w:val="both"/>
+        <w:rPr>
+          <w:lang w:val="en-US"/>
+        </w:rPr>
+      </w:pPr>
+      <w:r>
+        <w:rPr>
+          <w:lang w:val="en-US"/>
+        </w:rPr>
+        <w:t>:Editor</w:t>
+      </w:r>
+    </w:p>
+    <w:p>
+      <w:pPr>
+        <w:jc w:val="both"/>
+        <w:rPr>
+          <w:lang w:val="en-US"/>
+        </w:rPr>
+      </w:pPr>
+      <w:r>
+        <w:rPr>
+          <w:lang w:val="en-US"/>
+        </w:rPr>
+        <w:t xml:space="preserve">echo </w:t>
+      </w:r>
+      <w:r>
+        <w:t>Запуск</w:t>
+      </w:r>
+      <w:r>
+        <w:rPr>
+          <w:lang w:val="en-US"/>
+        </w:rPr>
+        <w:t xml:space="preserve"> </w:t>
+      </w:r>
+      <w:r>
+        <w:t>редактора</w:t>
+      </w:r>
+      <w:r>
+        <w:rPr>
+          <w:lang w:val="en-US"/>
+        </w:rPr>
+        <w:t>...</w:t>
+      </w:r>
+    </w:p>
+    <w:p>
+      <w:pPr>
+        <w:jc w:val="both"/>
+        <w:rPr>
+          <w:lang w:val="en-US"/>
+        </w:rPr>
+      </w:pPr>
+      <w:r>
+        <w:rPr>
+          <w:lang w:val="en-US"/>
+        </w:rPr>
+        <w:t>edit</w:t>
+      </w:r>
+    </w:p>
+    <w:p>
+      <w:pPr>
+        <w:jc w:val="both"/>
+      </w:pPr>
+      <w:r>
+        <w:t>exit /b 0</w:t>
+      </w:r>
+    </w:p>
+    <w:p>
+      <w:pPr>
+        <w:jc w:val="both"/>
+      </w:pPr>
+    </w:p>
+    <w:p>
+      <w:pPr>
+        <w:jc w:val="both"/>
+      </w:pPr>
+      <w:r>
+        <w:t>:Memory</w:t>
+      </w:r>
+    </w:p>
+    <w:p>
+      <w:pPr>
+        <w:jc w:val="both"/>
+      </w:pPr>
+      <w:r>
+        <w:t>if "%2"=="" (</w:t>
+      </w:r>
+    </w:p>
+    <w:p>
+      <w:pPr>
+        <w:jc w:val="both"/>
+      </w:pPr>
+      <w:r>
+        <w:lastRenderedPageBreak/>
+        <w:t xml:space="preserve">    echo Ошибка: Для режима Память требуется второй параметр</w:t>
+      </w:r>
+    </w:p>
+    <w:p>
+      <w:pPr>
+        <w:jc w:val="both"/>
+      </w:pPr>
+      <w:r>
+        <w:t xml:space="preserve">    exit /b 1</w:t>
+      </w:r>
+    </w:p>
+    <w:p>
+      <w:pPr>
+        <w:jc w:val="both"/>
+      </w:pPr>
+      <w:r>
+        <w:t>)</w:t>
+      </w:r>
+    </w:p>
+    <w:p>
+      <w:pPr>
+        <w:jc w:val="both"/>
+      </w:pPr>
+      <w:r>
+        <w:t>echo Запуск Mem с ключом %2</w:t>
+      </w:r>
+    </w:p>
+    <w:p>
+      <w:pPr>
+        <w:jc w:val="both"/>
+        <w:rPr>
+          <w:lang w:val="en-US"/>
+        </w:rPr>
+      </w:pPr>
+      <w:r>
+        <w:rPr>
+          <w:lang w:val="en-US"/>
+        </w:rPr>
+        <w:t>mem %2</w:t>
+      </w:r>
+    </w:p>
+    <w:p>
+      <w:pPr>
+        <w:jc w:val="both"/>
+        <w:rPr>
+          <w:lang w:val="en-US"/>
+        </w:rPr>
+      </w:pPr>
+      <w:r>
+        <w:rPr>
+          <w:lang w:val="en-US"/>
+        </w:rPr>
+        <w:t>exit /b 0</w:t>
+      </w:r>
+    </w:p>
+    <w:p>
+      <w:pPr>
+        <w:jc w:val="both"/>
+        <w:rPr>
+          <w:lang w:val="en-US"/>
+        </w:rPr>
+      </w:pPr>
+    </w:p>
+    <w:p>
+      <w:pPr>
+        <w:jc w:val="both"/>
+        <w:rPr>
+          <w:lang w:val="en-US"/>
+        </w:rPr>
+      </w:pPr>
+      <w:r>
+        <w:rPr>
+          <w:lang w:val="en-US"/>
+        </w:rPr>
+        <w:t>:Directory</w:t>
+      </w:r>
+    </w:p>
+    <w:p>
+      <w:pPr>
+        <w:jc w:val="both"/>
+        <w:rPr>
+          <w:lang w:val="en-US"/>
+        </w:rPr>
+      </w:pPr>
+      <w:r>
+        <w:rPr>
+          <w:lang w:val="en-US"/>
+        </w:rPr>
+        <w:t>if "%2"=="" (</w:t>
+      </w:r>
+    </w:p>
+    <w:p>
+      <w:pPr>
+        <w:jc w:val="both"/>
+      </w:pPr>
+      <w:r>
+        <w:rPr>
+          <w:lang w:val="en-US"/>
+        </w:rPr>
+        <w:t xml:space="preserve">    </w:t>
+      </w:r>
+      <w:r>
+        <w:t>echo Ошибка: Для режима Директория требуется путь к директории</w:t>
+      </w:r>
+    </w:p>
+    <w:p>
+      <w:pPr>
+        <w:jc w:val="both"/>
+      </w:pPr>
+      <w:r>
+        <w:t xml:space="preserve">    exit /b 1</w:t>
+      </w:r>
+    </w:p>
+    <w:p>
+      <w:pPr>
+        <w:jc w:val="both"/>
+      </w:pPr>
+      <w:r>
+        <w:t>)</w:t>
+      </w:r>
+    </w:p>
+    <w:p>
+      <w:pPr>
+        <w:jc w:val="both"/>
+      </w:pPr>
+      <w:r>
+        <w:t>if "%3"=="" (</w:t>
+      </w:r>
+    </w:p>
+    <w:p>
+      <w:pPr>
+        <w:jc w:val="both"/>
+      </w:pPr>
+      <w:r>
+        <w:t xml:space="preserve">    echo Ошибка: Для режима Директория требуется путь для файла</w:t>
+      </w:r>
+    </w:p>
+    <w:p>
+      <w:pPr>
+        <w:jc w:val="both"/>
+        <w:rPr>
+          <w:lang w:val="en-US"/>
+        </w:rPr>
+      </w:pPr>
+      <w:r>
+        <w:t xml:space="preserve">    </w:t>
+      </w:r>
+      <w:r>
+        <w:rPr>
+          <w:lang w:val="en-US"/>
+        </w:rPr>
+        <w:t>exit /b 1</w:t>
+      </w:r>
+    </w:p>
+    <w:p>
+      <w:pPr>
+        <w:jc w:val="both"/>
+        <w:rPr>
+          <w:lang w:val="en-US"/>
+        </w:rPr>
+      </w:pPr>
+      <w:r>
+        <w:rPr>
+          <w:lang w:val="en-US"/>
+        </w:rPr>
+        <w:t>)</w:t>
+      </w:r>
+    </w:p>
+    <w:p>
+      <w:pPr>
+        <w:jc w:val="both"/>
+        <w:rPr>
+          <w:lang w:val="en-US"/>
+        </w:rPr>
+      </w:pPr>
+      <w:r>
+        <w:rPr>
+          <w:lang w:val="en-US"/>
+        </w:rPr>
+        <w:t>dir "%2" &gt; "%3\dir_3.txt"</w:t>
+      </w:r>
+    </w:p>
+    <w:p>
+      <w:pPr>
+        <w:jc w:val="both"/>
+      </w:pPr>
+      <w:r>
+        <w:t>echo Содержимое записано в %3\dir_3.txt</w:t>
+      </w:r>
+    </w:p>
+    <w:p>
+      <w:pPr>
+        <w:jc w:val="both"/>
+      </w:pPr>
+      <w:r>
+        <w:t>exit /b 0</w:t>
+      </w:r>
+    </w:p>
+    <w:p>
+      <w:pPr>
         <w:ind w:firstLine="851"/>
         <w:jc w:val="both"/>
       </w:pPr>
-    </w:p>
-    <w:p>
-      <w:pPr>
-        <w:ind w:firstLine="851"/>
-        <w:jc w:val="both"/>
-      </w:pPr>
       <w:r>
         <w:t>Результат работы программы</w:t>
       </w:r>
@@ -950,9 +1384,53 @@
     </w:p>
     <w:p>
       <w:pPr>
-        <w:ind w:firstLine="851"/>
-        <w:jc w:val="both"/>
-      </w:pPr>
+        <w:jc w:val="both"/>
+        <w:rPr>
+          <w:lang w:val="en-US"/>
+        </w:rPr>
+      </w:pPr>
+      <w:r>
+        <w:rPr>
+          <w:lang w:val="en-US"/>
+        </w:rPr>
+        <w:drawing>
+          <wp:inline distT="0" distB="0" distL="0" distR="0" wp14:anchorId="37ECA1C1" wp14:editId="3250C50A">
+            <wp:extent cx="5940425" cy="3106420"/>
+            <wp:effectExtent l="0" t="0" r="3175" b="0"/>
+            <wp:docPr id="1" name="Рисунок 1"/>
+            <wp:cNvGraphicFramePr>
+              <a:graphicFrameLocks xmlns:a="http://schemas.openxmlformats.org/drawingml/2006/main" noChangeAspect="1"/>
+            </wp:cNvGraphicFramePr>
+            <a:graphic xmlns:a="http://schemas.openxmlformats.org/drawingml/2006/main">
+              <a:graphicData uri="http://schemas.openxmlformats.org/drawingml/2006/picture">
+                <pic:pic xmlns:pic="http://schemas.openxmlformats.org/drawingml/2006/picture">
+                  <pic:nvPicPr>
+                    <pic:cNvPr id="1" name=""/>
+                    <pic:cNvPicPr/>
+                  </pic:nvPicPr>
+                  <pic:blipFill>
+                    <a:blip r:embed="rId5"/>
+                    <a:stretch>
+                      <a:fillRect/>
+                    </a:stretch>
+                  </pic:blipFill>
+                  <pic:spPr>
+                    <a:xfrm>
+                      <a:off x="0" y="0"/>
+                      <a:ext cx="5940425" cy="3106420"/>
+                    </a:xfrm>
+                    <a:prstGeom prst="rect">
+                      <a:avLst/>
+                    </a:prstGeom>
+                  </pic:spPr>
+                </pic:pic>
+              </a:graphicData>
+            </a:graphic>
+          </wp:inline>
+        </w:drawing>
+      </w:r>
+      <w:bookmarkStart w:id="0" w:name="_GoBack"/>
+      <w:bookmarkEnd w:id="0"/>
     </w:p>
     <w:p>
       <w:pPr>
@@ -964,7 +1442,7 @@
           <w:bCs/>
           <w:color w:val="000000"/>
           <w:szCs w:val="28"/>
-          <w:lang w:val="en-US" w:eastAsia="ru-RU"/>
+          <w:lang w:eastAsia="ru-RU"/>
         </w:rPr>
       </w:pPr>
     </w:p>
@@ -977,7 +1455,7 @@
           <w:bCs/>
           <w:color w:val="000000"/>
           <w:szCs w:val="28"/>
-          <w:lang w:val="en-US" w:eastAsia="ru-RU"/>
+          <w:lang w:eastAsia="ru-RU"/>
         </w:rPr>
       </w:pPr>
       <w:r>
@@ -987,7 +1465,7 @@
           <w:bCs/>
           <w:color w:val="000000"/>
           <w:szCs w:val="28"/>
-          <w:lang w:val="en-US" w:eastAsia="ru-RU"/>
+          <w:lang w:eastAsia="ru-RU"/>
         </w:rPr>
         <w:br w:type="page"/>
       </w:r>

</xml_diff>